<commit_message>
Update education details and remove Ethnus Experience
</commit_message>
<xml_diff>
--- a/public/K_Prabhu_Resume_AI_Web_Developer.docx
+++ b/public/K_Prabhu_Resume_AI_Web_Developer.docx
@@ -213,6 +213,8 @@
             <w:pPr>
               <w:spacing w:after="20" w:line="252" w:lineRule="auto"/>
               <w:rPr>
+                <w:rFonts w:ascii="Times New Roman" w:hAnsi="Times New Roman"/>
+                <w:i/>
                 <w:sz w:val="24"/>
                 <w:szCs w:val="24"/>
               </w:rPr>
@@ -238,6 +240,109 @@
               <w:t xml:space="preserve"> in Computer Science (Specialization in Cybersecurity)</w:t>
             </w:r>
           </w:p>
+          <w:p>
+            <w:pPr>
+              <w:spacing w:after="20" w:line="252" w:lineRule="auto"/>
+              <w:rPr>
+                <w:rFonts w:ascii="Times New Roman" w:hAnsi="Times New Roman" w:cs="Times New Roman"/>
+                <w:sz w:val="24"/>
+                <w:szCs w:val="24"/>
+                <w:lang w:val="en-IN"/>
+              </w:rPr>
+            </w:pPr>
+            <w:r>
+              <w:rPr>
+                <w:rFonts w:ascii="Times New Roman" w:hAnsi="Times New Roman" w:cs="Times New Roman"/>
+                <w:b/>
+                <w:bCs/>
+                <w:sz w:val="24"/>
+                <w:szCs w:val="24"/>
+                <w:lang w:val="en-IN"/>
+              </w:rPr>
+              <w:t>Sunbeam High School</w:t>
+            </w:r>
+          </w:p>
+          <w:p>
+            <w:pPr>
+              <w:spacing w:after="20" w:line="252" w:lineRule="auto"/>
+              <w:rPr>
+                <w:rFonts w:ascii="Times New Roman" w:hAnsi="Times New Roman" w:cs="Times New Roman"/>
+                <w:sz w:val="24"/>
+                <w:szCs w:val="24"/>
+                <w:lang w:val="en-IN"/>
+              </w:rPr>
+            </w:pPr>
+            <w:r>
+              <w:rPr>
+                <w:rFonts w:ascii="Times New Roman" w:hAnsi="Times New Roman" w:cs="Times New Roman"/>
+                <w:i/>
+                <w:iCs/>
+                <w:sz w:val="24"/>
+                <w:szCs w:val="24"/>
+                <w:lang w:val="en-IN"/>
+              </w:rPr>
+              <w:t>Class XII (CBSE)</w:t>
+            </w:r>
+            <w:r>
+              <w:rPr>
+                <w:rFonts w:ascii="Times New Roman" w:hAnsi="Times New Roman" w:cs="Times New Roman"/>
+                <w:sz w:val="24"/>
+                <w:szCs w:val="24"/>
+                <w:lang w:val="en-IN"/>
+              </w:rPr>
+              <w:t xml:space="preserve"> </w:t>
+            </w:r>
+          </w:p>
+          <w:p>
+            <w:pPr>
+              <w:spacing w:after="20" w:line="252" w:lineRule="auto"/>
+              <w:rPr>
+                <w:rFonts w:ascii="Times New Roman" w:hAnsi="Times New Roman" w:cs="Times New Roman"/>
+                <w:sz w:val="24"/>
+                <w:szCs w:val="24"/>
+                <w:lang w:val="en-IN"/>
+              </w:rPr>
+            </w:pPr>
+            <w:r>
+              <w:rPr>
+                <w:rFonts w:ascii="Times New Roman" w:hAnsi="Times New Roman" w:cs="Times New Roman"/>
+                <w:b/>
+                <w:bCs/>
+                <w:sz w:val="24"/>
+                <w:szCs w:val="24"/>
+                <w:lang w:val="en-IN"/>
+              </w:rPr>
+              <w:t>B V Reddy Senior Secondary School</w:t>
+            </w:r>
+          </w:p>
+          <w:p>
+            <w:pPr>
+              <w:spacing w:after="20" w:line="252" w:lineRule="auto"/>
+              <w:rPr>
+                <w:sz w:val="24"/>
+                <w:szCs w:val="24"/>
+              </w:rPr>
+            </w:pPr>
+            <w:r>
+              <w:rPr>
+                <w:rFonts w:ascii="Times New Roman" w:hAnsi="Times New Roman" w:cs="Times New Roman"/>
+                <w:i/>
+                <w:iCs/>
+                <w:sz w:val="24"/>
+                <w:szCs w:val="24"/>
+                <w:lang w:val="en-IN"/>
+              </w:rPr>
+              <w:t>Class X (CBSE)</w:t>
+            </w:r>
+            <w:r>
+              <w:rPr>
+                <w:sz w:val="24"/>
+                <w:szCs w:val="24"/>
+                <w:lang w:val="en-IN"/>
+              </w:rPr>
+              <w:t xml:space="preserve"> </w:t>
+            </w:r>
+          </w:p>
         </w:tc>
         <w:tc>
           <w:tcPr>
@@ -245,9 +350,11 @@
           </w:tcPr>
           <w:p>
             <w:pPr>
-              <w:spacing w:after="20" w:line="252" w:lineRule="auto"/>
+              <w:spacing w:after="20"/>
               <w:jc w:val="right"/>
               <w:rPr>
+                <w:rFonts w:ascii="Times New Roman" w:hAnsi="Times New Roman"/>
+                <w:b/>
                 <w:sz w:val="24"/>
                 <w:szCs w:val="24"/>
               </w:rPr>
@@ -262,78 +369,113 @@
               <w:t>CGPA: 7.94</w:t>
             </w:r>
           </w:p>
-        </w:tc>
-      </w:tr>
-    </w:tbl>
-    <w:p>
-      <w:pPr>
-        <w:pBdr>
-          <w:bottom w:val="single" w:sz="6" w:space="1" w:color="333333"/>
-        </w:pBdr>
-        <w:spacing w:before="90" w:after="40" w:line="240" w:lineRule="auto"/>
-        <w:rPr>
-          <w:sz w:val="24"/>
-          <w:szCs w:val="24"/>
-        </w:rPr>
-      </w:pPr>
-      <w:r>
-        <w:rPr>
-          <w:rFonts w:ascii="Times New Roman" w:hAnsi="Times New Roman"/>
-          <w:b/>
-          <w:color w:val="111827"/>
-          <w:sz w:val="24"/>
-          <w:szCs w:val="24"/>
-        </w:rPr>
-        <w:t>EXPERIENCE</w:t>
-      </w:r>
-    </w:p>
-    <w:tbl>
-      <w:tblPr>
-        <w:tblW w:w="0" w:type="auto"/>
-        <w:tblLayout w:type="fixed"/>
-        <w:tblLook w:val="04A0" w:firstRow="1" w:lastRow="0" w:firstColumn="1" w:lastColumn="0" w:noHBand="0" w:noVBand="1"/>
-      </w:tblPr>
-      <w:tblGrid>
-        <w:gridCol w:w="5400"/>
-        <w:gridCol w:w="5400"/>
-      </w:tblGrid>
-      <w:tr>
-        <w:tc>
-          <w:tcPr>
-            <w:tcW w:w="5400" w:type="dxa"/>
-          </w:tcPr>
           <w:p>
             <w:pPr>
               <w:spacing w:after="20" w:line="252" w:lineRule="auto"/>
+              <w:jc w:val="right"/>
               <w:rPr>
+                <w:i/>
+                <w:iCs/>
                 <w:sz w:val="24"/>
                 <w:szCs w:val="24"/>
+                <w:lang w:val="en-IN"/>
+              </w:rPr>
+            </w:pPr>
+          </w:p>
+          <w:p>
+            <w:pPr>
+              <w:spacing w:after="20" w:line="252" w:lineRule="auto"/>
+              <w:jc w:val="right"/>
+              <w:rPr>
+                <w:rFonts w:ascii="Times New Roman" w:hAnsi="Times New Roman" w:cs="Times New Roman"/>
+                <w:i/>
+                <w:iCs/>
+                <w:sz w:val="24"/>
+                <w:szCs w:val="24"/>
+                <w:lang w:val="en-IN"/>
               </w:rPr>
             </w:pPr>
             <w:r>
               <w:rPr>
-                <w:rFonts w:ascii="Times New Roman" w:hAnsi="Times New Roman"/>
-                <w:b/>
+                <w:rFonts w:ascii="Times New Roman" w:hAnsi="Times New Roman" w:cs="Times New Roman"/>
+                <w:i/>
+                <w:iCs/>
                 <w:sz w:val="24"/>
                 <w:szCs w:val="24"/>
+                <w:lang w:val="en-IN"/>
               </w:rPr>
-              <w:t>MERN Full Stack Developer</w:t>
+              <w:t>2020 – 2022</w:t>
             </w:r>
+          </w:p>
+          <w:p>
+            <w:pPr>
+              <w:spacing w:after="20" w:line="252" w:lineRule="auto"/>
+              <w:jc w:val="right"/>
+              <w:rPr>
+                <w:rFonts w:ascii="Times New Roman" w:hAnsi="Times New Roman" w:cs="Times New Roman"/>
+                <w:sz w:val="24"/>
+                <w:szCs w:val="24"/>
+                <w:lang w:val="en-IN"/>
+              </w:rPr>
+            </w:pPr>
             <w:r>
               <w:rPr>
-                <w:rFonts w:ascii="Times New Roman" w:hAnsi="Times New Roman"/>
-                <w:i/>
+                <w:rFonts w:ascii="Times New Roman" w:hAnsi="Times New Roman" w:cs="Times New Roman"/>
+                <w:b/>
+                <w:bCs/>
                 <w:sz w:val="24"/>
                 <w:szCs w:val="24"/>
+                <w:lang w:val="en-IN"/>
               </w:rPr>
-              <w:t xml:space="preserve"> — Ethnus Virtual</w:t>
+              <w:t>Percentage: 76.8%</w:t>
             </w:r>
           </w:p>
-        </w:tc>
-        <w:tc>
-          <w:tcPr>
-            <w:tcW w:w="5400" w:type="dxa"/>
-          </w:tcPr>
+          <w:p>
+            <w:pPr>
+              <w:spacing w:after="20" w:line="252" w:lineRule="auto"/>
+              <w:jc w:val="right"/>
+              <w:rPr>
+                <w:rFonts w:ascii="Times New Roman" w:hAnsi="Times New Roman" w:cs="Times New Roman"/>
+                <w:sz w:val="24"/>
+                <w:szCs w:val="24"/>
+                <w:lang w:val="en-IN"/>
+              </w:rPr>
+            </w:pPr>
+            <w:r>
+              <w:rPr>
+                <w:rFonts w:ascii="Times New Roman" w:hAnsi="Times New Roman" w:cs="Times New Roman"/>
+                <w:i/>
+                <w:iCs/>
+                <w:sz w:val="24"/>
+                <w:szCs w:val="24"/>
+                <w:lang w:val="en-IN"/>
+              </w:rPr>
+              <w:t>2019 – 2020</w:t>
+            </w:r>
+          </w:p>
+          <w:p>
+            <w:pPr>
+              <w:spacing w:after="20" w:line="252" w:lineRule="auto"/>
+              <w:jc w:val="right"/>
+              <w:rPr>
+                <w:rFonts w:ascii="Times New Roman" w:hAnsi="Times New Roman" w:cs="Times New Roman"/>
+                <w:sz w:val="24"/>
+                <w:szCs w:val="24"/>
+                <w:lang w:val="en-IN"/>
+              </w:rPr>
+            </w:pPr>
+            <w:r>
+              <w:rPr>
+                <w:rFonts w:ascii="Times New Roman" w:hAnsi="Times New Roman" w:cs="Times New Roman"/>
+                <w:b/>
+                <w:bCs/>
+                <w:sz w:val="24"/>
+                <w:szCs w:val="24"/>
+                <w:lang w:val="en-IN"/>
+              </w:rPr>
+              <w:t>Percentage: 89.4%</w:t>
+            </w:r>
+          </w:p>
           <w:p>
             <w:pPr>
               <w:spacing w:after="20" w:line="252" w:lineRule="auto"/>
@@ -343,95 +485,10 @@
                 <w:szCs w:val="24"/>
               </w:rPr>
             </w:pPr>
-            <w:r>
-              <w:rPr>
-                <w:rFonts w:ascii="Times New Roman" w:hAnsi="Times New Roman"/>
-                <w:i/>
-                <w:sz w:val="24"/>
-                <w:szCs w:val="24"/>
-              </w:rPr>
-              <w:t>Jun 2024 – Aug 2024</w:t>
-            </w:r>
           </w:p>
         </w:tc>
       </w:tr>
     </w:tbl>
-    <w:p>
-      <w:pPr>
-        <w:pStyle w:val="ListBullet"/>
-        <w:spacing w:after="20" w:line="252" w:lineRule="auto"/>
-        <w:ind w:left="288"/>
-        <w:rPr>
-          <w:sz w:val="24"/>
-          <w:szCs w:val="24"/>
-        </w:rPr>
-      </w:pPr>
-      <w:r>
-        <w:rPr>
-          <w:rFonts w:ascii="Times New Roman" w:hAnsi="Times New Roman"/>
-          <w:sz w:val="24"/>
-          <w:szCs w:val="24"/>
-        </w:rPr>
-        <w:t>Built a full-stack job portal using MERN Stack with secure authentication and RESTful APIs.</w:t>
-      </w:r>
-    </w:p>
-    <w:p>
-      <w:pPr>
-        <w:pStyle w:val="ListBullet"/>
-        <w:spacing w:after="20" w:line="252" w:lineRule="auto"/>
-        <w:ind w:left="288"/>
-        <w:rPr>
-          <w:sz w:val="24"/>
-          <w:szCs w:val="24"/>
-        </w:rPr>
-      </w:pPr>
-      <w:r>
-        <w:rPr>
-          <w:rFonts w:ascii="Times New Roman" w:hAnsi="Times New Roman"/>
-          <w:sz w:val="24"/>
-          <w:szCs w:val="24"/>
-        </w:rPr>
-        <w:t>Improved system responsiveness by 30% and boosted platform engagement by 20%.</w:t>
-      </w:r>
-    </w:p>
-    <w:p>
-      <w:pPr>
-        <w:pStyle w:val="ListBullet"/>
-        <w:spacing w:after="20" w:line="252" w:lineRule="auto"/>
-        <w:ind w:left="288"/>
-        <w:rPr>
-          <w:sz w:val="24"/>
-          <w:szCs w:val="24"/>
-        </w:rPr>
-      </w:pPr>
-      <w:r>
-        <w:rPr>
-          <w:rFonts w:ascii="Times New Roman" w:hAnsi="Times New Roman"/>
-          <w:sz w:val="24"/>
-          <w:szCs w:val="24"/>
-        </w:rPr>
-        <w:t>Designed a responsive and accessible UI, increasing usability and traffic by 25%.</w:t>
-      </w:r>
-    </w:p>
-    <w:p>
-      <w:pPr>
-        <w:pStyle w:val="ListBullet"/>
-        <w:spacing w:after="20" w:line="252" w:lineRule="auto"/>
-        <w:ind w:left="288"/>
-        <w:rPr>
-          <w:sz w:val="24"/>
-          <w:szCs w:val="24"/>
-        </w:rPr>
-      </w:pPr>
-      <w:r>
-        <w:rPr>
-          <w:rFonts w:ascii="Times New Roman" w:hAnsi="Times New Roman"/>
-          <w:sz w:val="24"/>
-          <w:szCs w:val="24"/>
-        </w:rPr>
-        <w:t>Strengthened data integrity and security using MongoDB and JWT-based authentication.</w:t>
-      </w:r>
-    </w:p>
     <w:p>
       <w:pPr>
         <w:pBdr>
@@ -873,10 +930,8 @@
         <w:r>
           <w:rPr>
             <w:rFonts w:ascii="Times New Roman" w:hAnsi="Times New Roman"/>
-            <w:color w:val="0044CC"/>
             <w:sz w:val="24"/>
             <w:szCs w:val="24"/>
-            <w:u w:val="single"/>
           </w:rPr>
           <w:t>Google AI Professional Certificate</w:t>
         </w:r>
@@ -1131,7 +1186,7 @@
   <w:abstractNum w:abstractNumId="8" w15:restartNumberingAfterBreak="0">
     <w:nsid w:val="FFFFFF89"/>
     <w:multiLevelType w:val="singleLevel"/>
-    <w:tmpl w:val="29761A62"/>
+    <w:tmpl w:val="D31EBB2C"/>
     <w:lvl w:ilvl="0">
       <w:start w:val="1"/>
       <w:numFmt w:val="bullet"/>
@@ -1782,7 +1837,6 @@
   <w:style w:type="character" w:default="1" w:styleId="DefaultParagraphFont">
     <w:name w:val="Default Paragraph Font"/>
     <w:uiPriority w:val="1"/>
-    <w:semiHidden/>
     <w:unhideWhenUsed/>
   </w:style>
   <w:style w:type="table" w:default="1" w:styleId="TableNormal">

</xml_diff>